<commit_message>
Melhorias na geração de EN e tela de Historico
</commit_message>
<xml_diff>
--- a/apps/api/templates/Modelo_Especificacao_Negocio.docx
+++ b/apps/api/templates/Modelo_Especificacao_Negocio.docx
@@ -6272,35 +6272,40 @@
         <w:rPr>
           <w:color w:val="262626"/>
         </w:rPr>
-        <w:t>Ao aprovar esta Especificação de Negócio (versão {</w:t>
-      </w:r>
-      <w:proofErr w:type="spellStart"/>
+        <w:t>Ao aprovar esta Especificação de Negócio, o Cliente declara estar ciente e de acordo com o escopo, premissas, restrições e requisitos funcionais aqui descritos.</w:t>
+      </w:r>
+    </w:p>
+    <w:p>
+      <w:pPr>
+        <w:spacing w:after="160" w:line="288" w:lineRule="auto"/>
+      </w:pPr>
       <w:r>
         <w:rPr>
           <w:color w:val="262626"/>
         </w:rPr>
-        <w:t>versaoAtual</w:t>
-      </w:r>
-      <w:proofErr w:type="spellEnd"/>
+        <w:t>Este documento constitui o instrumento formal de definição do objeto desta entrega e é vinculante para ambas as partes.</w:t>
+      </w:r>
+    </w:p>
+    <w:p>
+      <w:pPr>
+        <w:spacing w:after="160" w:line="288" w:lineRule="auto"/>
+      </w:pPr>
       <w:r>
         <w:rPr>
           <w:color w:val="262626"/>
         </w:rPr>
-        <w:t>}, de {</w:t>
-      </w:r>
-      <w:proofErr w:type="spellStart"/>
+        <w:t>Qualquer alteração de escopo posterior à aprovação deste documento deverá ser formalizada por meio de nova especificação, sujeita a análise de impacto e aprovação pelas partes.</w:t>
+      </w:r>
+    </w:p>
+    <w:p>
+      <w:pPr>
+        <w:spacing w:after="160" w:line="288" w:lineRule="auto"/>
+      </w:pPr>
       <w:r>
         <w:rPr>
           <w:color w:val="262626"/>
         </w:rPr>
-        <w:t>dataAtual</w:t>
-      </w:r>
-      <w:proofErr w:type="spellEnd"/>
-      <w:r>
-        <w:rPr>
-          <w:color w:val="262626"/>
-        </w:rPr>
-        <w:t>}), o Cliente declara estar ciente do escopo, das premissas, das restrições e dos requisitos funcionais aqui descritos, e concorda com os termos apresentados. Este documento poderá ser anexado a instrumentos formais de aprovação (ex.: termo de aceite com certificação digital) mantidos fora deste arquivo.</w:t>
+        <w:t>Funcionalidades, comportamentos ou correções não descritos nesta especificação não fazem parte desta entrega e não poderão ser exigidos sem novo processo de especificação.</w:t>
       </w:r>
     </w:p>
     <w:p>

</xml_diff>